<commit_message>
fix(phase2): isolate provisional finance cases and make Khoa runs reproducible
</commit_message>
<xml_diff>
--- a/phase2/runs/khoa/MCP-TS-SDK-phase2-script.docx
+++ b/phase2/runs/khoa/MCP-TS-SDK-phase2-script.docx
@@ -72,12 +72,12 @@
         <w:pStyle w:val="Heading2"/>
       </w:pPr>
       <w:r>
-        <w:t>Slide 4 Three servers have separate jobs</w:t>
+        <w:t>Slide 4 Two active servers and a pending finance feature</w:t>
       </w:r>
     </w:p>
     <w:p>
       <w:r>
-        <w:t>Our measured setup has three servers and twenty-seven tools. Academic handles university records and the new student support features. Utility provides small shared functions, such as time and report saving. Finance handles money-related records. Keeping finance separate lets the host enable it only when it is needed. These tool counts come from the actual capability list in our log.</w:t>
+        <w:t>The current shared test set uses academic and utility on main. Together they expose twenty tools. Finance is a separate pending feature with seven tools. Its sample data is different, so we keep its questions and examples provisional until it is rebased and merged. The main benchmark does not enable finance.</w:t>
       </w:r>
     </w:p>
     <w:p>
@@ -90,7 +90,7 @@
     </w:p>
     <w:p>
       <w:r>
-        <w:t>The academic sample has forty valid students, twenty teachers and forty-one sections. It also has two hundred and sixty-one valid grade rows, attendance records and conduct scores. Finance was tested from Tien’s feature branch because it is not merged into main yet. Its teacher and conduct records differ, so each financial calculation uses that branch’s complete matching snapshot.</w:t>
+        <w:t>The academic sample on main has forty valid students, twenty teachers and forty-one sections. It also has two hundred and sixty-one valid grade rows, attendance records and conduct scores. Finance is still in a separate pull request. Its teacher and conduct records differ. We exclude those financial expectations from the shared test file and label them provisional in the workbook.</w:t>
       </w:r>
     </w:p>
     <w:p>
@@ -204,12 +204,12 @@
         <w:pStyle w:val="Heading2"/>
       </w:pPr>
       <w:r>
-        <w:t>Slide 13 Finance begins with tuition</w:t>
+        <w:t>Slide 13 Provisional tuition example from finance PR2</w:t>
       </w:r>
     </w:p>
     <w:p>
       <w:r>
-        <w:t>Tien’s tuition tools show the amount due, the amount paid and the remaining balance. The balance is the amount due minus the amount paid. We test paid and unpaid payment examples. We also ask for the total outstanding balance of a class. These financial values come from the finance snapshot, and the complete results are in the new logs.</w:t>
+        <w:t>This is a provisional tuition example from the finance pull request. The server calculates the amount due, the amount paid and the remaining balance. A balance is the amount due minus the amount paid. These figures were measured on the older finance snapshot. We keep them for explaining the feature, but we must recalculate them after finance uses the shared data on main.</w:t>
       </w:r>
     </w:p>
     <w:p>
@@ -217,12 +217,12 @@
         <w:pStyle w:val="Heading2"/>
       </w:pPr>
       <w:r>
-        <w:t>Slide 14 Scholarship decisions are calculated in code</w:t>
+        <w:t>Slide 14 Scholarship rules in the pending finance feature</w:t>
       </w:r>
     </w:p>
     <w:p>
       <w:r>
-        <w:t>Scholarship eligibility has several conditions. A high GPA alone is not enough. The finance server checks conduct, tuition and owed courses as well. The ranking tool then orders eligible candidates by GPA and conduct, with the student ID as a final tie-break. The model reports the server’s decision. It should not decide scholarship eligibility from a student’s name or from GPA alone.</w:t>
+        <w:t>The pending finance feature checks several conditions for a scholarship. A high GPA alone is not enough. The code also checks conduct, paid tuition and owed courses. We can explain these rules now. However, the financial test expectations remain provisional until the feature uses the same student and conduct data as main.</w:t>
       </w:r>
     </w:p>
     <w:p>
@@ -230,12 +230,12 @@
         <w:pStyle w:val="Heading2"/>
       </w:pPr>
       <w:r>
-        <w:t>Slide 15 The scholarship ranking has a checked result</w:t>
+        <w:t>Slide 15 Provisional scholarship ranking from finance PR2</w:t>
       </w:r>
     </w:p>
     <w:p>
       <w:r>
-        <w:t>This is a concrete ranking example from our finance snapshot. The question asks for scholarship S C H zero two in Information Technology. The Excel sheet checks the eligibility conditions for each student and calculates a rank. We compare the tool’s eligible count and first candidate with that independent reference. The result is a candidate list, not an automatic scholarship approval.</w:t>
+        <w:t>This ranking is an example from the older finance snapshot. Nine candidates qualify and student two two zero one zero one six ranks first. Those numbers are provisional. They do not describe the current shared dataset. After finance is rebased and merged, we will recalculate the candidate list from the common CSV files before restoring this test to the benchmark.</w:t>
       </w:r>
     </w:p>
     <w:p>
@@ -248,12 +248,12 @@
         <w:pStyle w:val="Heading2"/>
       </w:pPr>
       <w:r>
-        <w:t>Slide 16 Teacher pay has visible calculation steps</w:t>
+        <w:t>Slide 16 Provisional teacher pay calculation</w:t>
       </w:r>
     </w:p>
     <w:p>
       <w:r>
-        <w:t>Teacher pay uses the teacher’s assigned sections and a payroll row. Weekly periods are converted to monthly periods with the configured number of weeks. The title selects the rate per period. The calculation then adds teaching pay, overtime and other bonuses, and subtracts deductions. We check a single teacher and the faculty payroll total. All payroll records are fictional test data.</w:t>
+        <w:t>The pending payroll feature uses assigned sections and a payroll row. It converts weekly teaching periods to monthly periods, selects the rate by teacher title, adds teaching pay and bonuses, then subtracts deductions. Teacher T zero zero one in the old finance snapshot is a different record from T zero zero one on main. We therefore keep this payroll example separate and provisional. All payroll data is fictional.</w:t>
       </w:r>
     </w:p>
     <w:p>
@@ -261,7 +261,7 @@
         <w:pStyle w:val="Heading2"/>
       </w:pPr>
       <w:r>
-        <w:t>Slide 17 Sensitive actions need confirmation</w:t>
+        <w:t>Slide 17 Access and confirmation in the finance feature</w:t>
       </w:r>
     </w:p>
     <w:p>
@@ -274,12 +274,12 @@
         <w:pStyle w:val="Heading2"/>
       </w:pPr>
       <w:r>
-        <w:t>Slide 18 Our test set covers the new features</w:t>
+        <w:t>Slide 18 Shared test cases and provisional finance cases</w:t>
       </w:r>
     </w:p>
     <w:p>
       <w:r>
-        <w:t>Khoa’s new test set contains twenty-four natural English questions. Fifteen cover academic tools and advising. Nine cover finance, including all six read-only finance tools. The cases include valid inputs, empty results, invalid IDs and exact boundaries. The answer key has fifty-five checked metrics. The shared benchmark can use these questions and expected values when the team combines the final features.</w:t>
+        <w:t>The shared test file now contains fifteen natural English questions, all using main. It covers teacher tools, attendance, conduct, risk and advising. The nine finance questions are in a separate provisional file. The workbook contains twenty-nine source-linked metrics for the shared cases and twenty-six provisional finance metrics. Only the fifteen shared cases should be copied into the current team benchmark.</w:t>
       </w:r>
     </w:p>
     <w:p>
@@ -297,7 +297,7 @@
     </w:p>
     <w:p>
       <w:r>
-        <w:t>The workbook is designed so we can check the answers ourselves. First, find the question ID on the Answers sheet. Then follow the formula to the source rows and rule values. Check the intermediate numbers, such as absences, credits or teaching periods. Finally, compare the result with the tool output. The formulas were also cross-checked independently from the CSV files.</w:t>
+        <w:t>First, check the scope column in the workbook. Main rows belong to the shared benchmark. Provisional rows belong to the pending finance snapshot. Next, read the arithmetic on the Manual sheet and follow the source-linked formulas on Answers. We checked the exact absence boundary and the risk reasons against the raw CSV files. Finally, compare the result and its explanation with the log.</w:t>
       </w:r>
     </w:p>
     <w:p>
@@ -310,7 +310,7 @@
     </w:p>
     <w:p>
       <w:r>
-        <w:t>We keep the main model settings fixed for Khoa’s model run. We use Gemini Flash Lite with temperature zero point two and a maximum of eight tool rounds. Each question starts a fresh conversation. Model fallback is disabled, so the model recorded in the log is the model we intended to test. We pace requests to respect the free-tier request limit.</w:t>
+        <w:t>The current main-only Gemini run uses Flash Lite with temperature zero point two and a maximum of eight tool rounds. Each question starts a fresh conversation. Fallback is disabled. The configuration enables academic and utility only. The committed runner reads the fifteen questions directly from the shared CSV and records the configuration and source hashes.</w:t>
       </w:r>
     </w:p>
     <w:p>
@@ -318,12 +318,12 @@
         <w:pStyle w:val="Heading2"/>
       </w:pPr>
       <w:r>
-        <w:t>Slide 21 Khoa results from the new test set</w:t>
+        <w:t>Slide 21 New results on the shared main dataset</w:t>
       </w:r>
     </w:p>
     <w:p>
       <w:r>
-        <w:t>These are results from the new twenty-four-question test set. The direct MCP tests check tool outputs without a language model. The Gemini run also checks the selected tools and the required arguments. These checks cover exact values, but they do not replace reading the final answers. An advising summary can contain the right numbers and still leave out a useful explanation.</w:t>
+        <w:t>These new runs use only the fifteen shared cases on main. We ran the committed script through direct MCP over standard input and output, direct MCP over HTTP, and Gemini. The table shows the measured results from those logs. The earlier twenty-four-case run is saved separately as historical evidence because it mixed two snapshots. It is not the shared benchmark result.</w:t>
       </w:r>
     </w:p>
     <w:p>
@@ -341,7 +341,7 @@
     </w:p>
     <w:p>
       <w:r>
-        <w:t>We record both time and token use. Direct MCP time measures the local tool path. Gemini question time also includes model requests and any retry wait inside the question. The pacing gap between questions is outside this measurement. These are single runs on this machine, so we should report the numbers as observations rather than claim that one transport is always faster.</w:t>
+        <w:t>These times and token totals come from the new main-only run. Direct MCP time measures the local tool path. Gemini time also includes model requests and any retries inside a question. The pacing gap between questions is outside the per-question measurement. One run is a small sample, so we report these observations without claiming that one transport is always faster.</w:t>
       </w:r>
     </w:p>
     <w:p>
@@ -398,7 +398,7 @@
     </w:p>
     <w:p>
       <w:r>
-        <w:t>The earlier model comparison used eleven cases, with two runs per model, on another machine. All three measured models passed those turns. The local instruct model had a lower median model time, while the thinking model took much longer. We keep these historical results separate from Khoa’s new twenty-four-case run. They are useful context, not a new Qwen measurement on this machine.</w:t>
+        <w:t>The earlier model comparison used eleven cases, with two runs per model, on another machine. All three measured models passed those turns. The instruct model was faster than the thinking model in that test. These are historical results. They are separate from the new fifteen-case Gemini run on main and do not provide a new direct Qwen comparison on this machine.</w:t>
       </w:r>
     </w:p>
     <w:p>
@@ -406,12 +406,12 @@
         <w:pStyle w:val="Heading2"/>
       </w:pPr>
       <w:r>
-        <w:t>Slide 27 Context budget must match the actual tool set</w:t>
+        <w:t>Slide 27 Context budget depends on the enabled tools</w:t>
       </w:r>
     </w:p>
     <w:p>
       <w:r>
-        <w:t>Tool schemas use part of the model’s context window. Tien measured an earlier twenty-tool setup on Qwen. It used about two thousand nine hundred and eighty-one tokens for tools, system text and the template, leaving room in an eight-thousand-one-hundred-and-ninety-two-token context. Our combined setup has twenty-seven tools, so we should measure it again instead of treating the old number as its exact budget.</w:t>
+        <w:t>The current academic and utility configuration exposes twenty tools. The historical configuration with provisional finance exposed twenty-seven. Tien also measured an earlier tool set on Qwen, using about two thousand nine hundred and eighty-one prompt tokens in an eight-thousand-one-hundred-and-ninety-two-token context. A matching tool count does not prove a matching token budget. We should measure the actual final tool schemas after finance merges.</w:t>
       </w:r>
     </w:p>
     <w:p>
@@ -429,7 +429,7 @@
     </w:p>
     <w:p>
       <w:r>
-        <w:t>Several improvements came from actual problems. A grade update now keeps a score that the user did not ask to change. The host prompt asks the model to use the language of the latest question. Benchmarks disable fallback so results are attributed correctly. In Khoa’s test pack, independent Excel expectations help us detect a calculation error that a tool-derived answer key could otherwise repeat.</w:t>
+        <w:t>Several improvements follow observed problems. A grade update keeps omitted scores unchanged. The host follows the language of the question. Benchmarks disable fallback. In the new Khoa run, we clarified that a risk result reports the maximum section absence rate, while the attendance summary reports the aggregate rate for its scope. The earlier wording mistake and the corrected answer are kept in separate logs for comparison.</w:t>
       </w:r>
     </w:p>
     <w:p>
@@ -442,7 +442,7 @@
     </w:p>
     <w:p>
       <w:r>
-        <w:t>Our results have clear limits. Finance is tested from its feature snapshot because the final merge is still pending. Its records must not be mixed with a different teacher or conduct snapshot. One run per configuration is also a small sample. The next useful step is to repeat the complete set after the final merge and review the final advising explanations, not only their numbers.</w:t>
+        <w:t>The main limitation is the pending finance integration. We have moved those nine questions out of the shared CSV. After finance is rebased and merged, we must replace the provisional teacher, section and conduct inputs with the shared data, recalculate the financial answers and run the tests again. The historical logs stay unchanged as evidence of what was measured before the review.</w:t>
       </w:r>
     </w:p>
     <w:p>
@@ -455,7 +455,7 @@
     </w:p>
     <w:p>
       <w:r>
-        <w:t>For a short live demonstration, we can start with a teacher workload question. Next, we compare the two attendance boundary cases. Then we ask about scholarship eligibility and ranking. At the end, we open a log and show the actual tool arguments and returned result. This order is easy to follow and connects the feature, the answer key and the measured evidence.</w:t>
+        <w:t>The live demonstration uses the current shared dataset. Start with the workload of teacher T zero zero one. Then compare the two attendance boundary cases. Next, ask for the risk reasons in class IT zero one. Finally, open the current log and show the actual tool call and result. Finance examples can be explained from the slides, but they are provisional and are not part of this live main-only demonstration.</w:t>
       </w:r>
     </w:p>
     <w:p>
@@ -525,7 +525,7 @@
     </w:p>
     <w:p>
       <w:r>
-        <w:t>Academic features are on main. Finance is still in a separate pull request. We tested that feature from its matching snapshot and kept its expected values separate.</w:t>
+        <w:t>The shared benchmark uses main only. Finance remains in a separate pending pull request, so its older examples are provisional and excluded from the shared test file.</w:t>
       </w:r>
     </w:p>
     <w:p>
@@ -587,7 +587,7 @@
     </w:p>
     <w:p>
       <w:r>
-        <w:t>Khoa recorded checks and Gemini run in check-stdio.jsonl check-http.jsonl and gemini-stdio.jsonl</w:t>
+        <w:t>Current 15-case main-only checks in check-stdio.jsonl check-http.jsonl and gemini-stdio.jsonl; older 24-case provisional run under historical/</w:t>
       </w:r>
     </w:p>
     <w:p>

</xml_diff>